<commit_message>
Slide 5: frame elevated synthetic churn rate vs real 0.8% baseline
</commit_message>
<xml_diff>
--- a/deck/presentation_speech_script.docx
+++ b/deck/presentation_speech_script.docx
@@ -438,22 +438,22 @@
           <w:sz w:val="19"/>
           <w:szCs w:val="19"/>
         </w:rPr>
-        <w:t xml:space="preserve">Target time: ~40 sec</w:t>
-      </w:r>
-    </w:p>
-    <w:p>
-      <w:pPr>
-        <w:spacing w:after="160" w:line="300"/>
-      </w:pPr>
-      <w:r>
-        <w:rPr>
-          <w:i/>
-          <w:iCs/>
-          <w:color w:val="1A1A1A"/>
-          <w:sz w:val="23"/>
-          <w:szCs w:val="23"/>
-        </w:rPr>
-        <w:t xml:space="preserve">This layer's job is pure routing — which churn mode is this account most likely heading toward, so the right causal effect size gets applied downstream. Churn here is rare, about eleven percent combined across modes, and driven by noisy human behavior, so this isn't a 0.95-AUC problem — ROC-AUC lands in the 0.65 to 0.72 range per mode, with 2.8 to 3.2x lift at the top decile. In production you'd rank and act on the top slice your capacity allows, not hard-classify at a single threshold — exactly the same logic as the HV/LV split on the next several slides.</w:t>
+        <w:t xml:space="preserve">Target time: ~50 sec</w:t>
+      </w:r>
+    </w:p>
+    <w:p>
+      <w:pPr>
+        <w:spacing w:after="160" w:line="300"/>
+      </w:pPr>
+      <w:r>
+        <w:rPr>
+          <w:i/>
+          <w:iCs/>
+          <w:color w:val="1A1A1A"/>
+          <w:sz w:val="23"/>
+          <w:szCs w:val="23"/>
+        </w:rPr>
+        <w:t xml:space="preserve">This layer's job is pure routing — which churn mode is this account most likely heading toward, so the right causal effect size gets applied downstream. Churn here is rare, about eleven percent combined across modes — and I'll flag this up front rather than wait to be asked: that's deliberately elevated above the real project's roughly 0.8% observed baseline. With only a few thousand HV and LV accounts in this synthetic panel, a true 0.8% base rate wouldn't leave enough injected churn events per mode for the RDD, DiD, and RCT layers to have real statistical power — so the elevated rate is a demo-scale choice, not a claim about what real DDA churn looks like. ROC-AUC lands in the 0.65 to 0.72 range per mode, with 2.8 to 3.2x lift at the top decile — this isn't a 0.95-AUC problem, and forcing one would mean overfitting noise. In production you'd rank and act on the top slice your capacity allows, not hard-classify at a single threshold — exactly the same logic as the HV/LV split on the next several slides.</w:t>
       </w:r>
     </w:p>
     <w:p>

</xml_diff>